<commit_message>
[Documentation] Sync HW5 deliverable with renamed Loader/Store/ComplianceRule
Update sequence diagrams (UC-01, UC-03, UC-04) and the implementation class
diagram so lifelines, fields, and method signatures reflect the new domain
vocabulary; re-export and re-rotate the SD PNGs and re-embed them along with
the refreshed class diagram into 113598009_5.docx.
</commit_message>
<xml_diff>
--- a/hw/hw5/113598009_5.docx
+++ b/hw/hw5/113598009_5.docx
@@ -4839,7 +4839,7 @@
               <w:rPr>
                 <w:rFonts w:eastAsia="標楷體"/>
               </w:rPr>
-              <w:t>6. 系統對每個 CompilationUnit 套用 Profile 中所有 ArchitectureConstraint 規則</w:t>
+              <w:t>6. 系統對每個 CompilationUnit 套用 Profile 中所有 ComplianceRule 規則</w:t>
             </w:r>
           </w:p>
           <w:p>
@@ -7291,7 +7291,7 @@
               <w:rPr>
                 <w:rFonts w:eastAsia="標楷體"/>
               </w:rPr>
-              <w:t>3. 系統展示第一條 Violation，顯示：檔案路徑與行號、違反的 ArchitectureConstraint ID 與說明、RefactoringSuggestion（若存在）</w:t>
+              <w:t>3. 系統展示第一條 Violation，顯示：檔案路徑與行號、違反的 ComplianceRule ID 與說明、RefactoringSuggestion（若存在）</w:t>
             </w:r>
           </w:p>
           <w:p>
@@ -7331,7 +7331,7 @@
               <w:rPr>
                 <w:rFonts w:eastAsia="標楷體"/>
               </w:rPr>
-              <w:t>5. Developer 輸入 y：系統將此 Violation 的 constraint ID 與時間戳記寫入 .arch-checker-suppress.yaml</w:t>
+              <w:t>5. Developer 輸入 y：系統將此 Violation 的 rule ID 與時間戳記寫入 .arch-checker-suppress.yaml</w:t>
             </w:r>
           </w:p>
           <w:p>
@@ -7656,7 +7656,7 @@
               <w:rPr>
                 <w:rFonts w:eastAsia="標楷體"/>
               </w:rPr>
-              <w:t>*a. Suppression 記錄寫入 .arch-checker-suppress.yaml，包含：constraint ID、reason（預設為 suppressed interactively）、timestamp</w:t>
+              <w:t>*a. Suppression 記錄寫入 .arch-checker-suppress.yaml，包含：rule ID、reason（預設為 suppressed interactively）、timestamp</w:t>
             </w:r>
           </w:p>
           <w:p>
@@ -7873,7 +7873,7 @@
         <w:rPr>
           <w:rFonts w:eastAsia="標楷體"/>
         </w:rPr>
-        <w:t>Developer 發出抑制特定違規的要求，並提供 constraint ID 與原因說明。系統將 suppression 記錄（constraint ID、reason、timestamp）寫入 .arch-checker-suppress.yaml。下次執行 UC-01 時，於 Step 8 過濾生效。</w:t>
+        <w:t>Developer 發出抑制特定違規的要求，並提供 rule ID 與原因說明。系統將 suppression 記錄（rule ID、reason、timestamp）寫入 .arch-checker-suppress.yaml。下次執行 UC-01 時，於 Step 8 過濾生效。</w:t>
       </w:r>
     </w:p>
     <w:p>
@@ -7913,7 +7913,7 @@
         <w:rPr>
           <w:rFonts w:eastAsia="標楷體"/>
         </w:rPr>
-        <w:t>UC-01 與 UC-03 的 &lt;&lt;include&gt;&gt; 子流程。系統讀取使用者指定的 Style Profile YAML 檔，解析並驗證規則定義。成功後將 Profile 載入記憶體，供各 constraint checker 使用。</w:t>
+        <w:t>UC-01 與 UC-03 的 &lt;&lt;include&gt;&gt; 子流程。系統讀取使用者指定的 Style Profile YAML 檔，解析並驗證規則定義。成功後將 Profile 載入記憶體，供各 rule checker 使用。</w:t>
       </w:r>
     </w:p>
     <w:p>
@@ -8814,7 +8814,7 @@
               <w:rPr>
                 <w:rFonts w:eastAsia="標楷體"/>
               </w:rPr>
-              <w:t>ArchitectureConstraint</w:t>
+              <w:t>ComplianceRule</w:t>
             </w:r>
           </w:p>
         </w:tc>
@@ -8906,7 +8906,7 @@
               <w:rPr>
                 <w:rFonts w:eastAsia="標楷體"/>
               </w:rPr>
-              <w:t>一種 ArchitectureConstraint，要求特定 package 內的 class 必須 implement 指定 interface 或 extend 指定 class；以 simple name 比對，不進行 fully qualified name resolution</w:t>
+              <w:t>一種 ComplianceRule，要求特定 package 內的 class 必須 implement 指定 interface 或 extend 指定 class；以 simple name 比對，不進行 fully qualified name resolution</w:t>
             </w:r>
           </w:p>
         </w:tc>
@@ -10390,7 +10390,7 @@
               <w:rPr>
                 <w:rFonts w:eastAsia="標楷體"/>
               </w:rPr>
-              <w:t>使用者以 YAML 定義的架構規則集合，包含多條 ArchitectureConstraint。系統在 UC-01 載入 Profile 後，於 UC-02 逐條驗證其中的約束規則。</w:t>
+              <w:t>使用者以 YAML 定義的架構規則集合，包含多條 ComplianceRule。系統在 UC-01 載入 Profile 後，於 UC-02 逐條驗證其中的約束規則。</w:t>
             </w:r>
           </w:p>
         </w:tc>
@@ -10424,7 +10424,7 @@
                 <w:b/>
                 <w:bCs/>
               </w:rPr>
-              <w:t>ArchitectureConstraint</w:t>
+              <w:t>ComplianceRule</w:t>
             </w:r>
           </w:p>
         </w:tc>
@@ -10518,7 +10518,7 @@
               <w:rPr>
                 <w:rFonts w:eastAsia="標楷體"/>
               </w:rPr>
-              <w:t>ArchitectureConstraint 的四種具體子類型，分別檢查類別命名慣例、套件間依賴方向、繼承關係要求與套件結構規範。UC-02 驗證流程中依規則類型分派不同的檢查邏輯。</w:t>
+              <w:t>ComplianceRule 的四種具體子類型，分別檢查類別命名慣例、套件間依賴方向、繼承關係要求與套件結構規範。UC-02 驗證流程中依規則類型分派不同的檢查邏輯。</w:t>
             </w:r>
           </w:p>
         </w:tc>
@@ -10777,7 +10777,7 @@
               <w:rPr>
                 <w:rFonts w:eastAsia="標楷體"/>
               </w:rPr>
-              <w:t>單筆架構違規記錄，記載哪個 File 違反了哪條 ArchitectureConstraint。為 ViolationReport 的明細項目。</w:t>
+              <w:t>單筆架構違規記錄，記載哪個 File 違反了哪條 ComplianceRule。為 ViolationReport 的明細項目。</w:t>
             </w:r>
           </w:p>
         </w:tc>
@@ -11831,7 +11831,7 @@
                 <w:b/>
                 <w:bCs/>
               </w:rPr>
-              <w:t>StyleProfile Contains ArchitectureConstraint</w:t>
+              <w:t>StyleProfile Contains ComplianceRule</w:t>
             </w:r>
           </w:p>
         </w:tc>
@@ -12114,7 +12114,7 @@
                 <w:b/>
                 <w:bCs/>
               </w:rPr>
-              <w:t>Violation Violates ArchitectureConstraint</w:t>
+              <w:t>Violation Violates ComplianceRule</w:t>
             </w:r>
           </w:p>
         </w:tc>
@@ -12302,7 +12302,7 @@
                 <w:b/>
                 <w:bCs/>
               </w:rPr>
-              <w:t>Suppression Targets ArchitectureConstraint</w:t>
+              <w:t>Suppression Targets ComplianceRule</w:t>
             </w:r>
           </w:p>
         </w:tc>
@@ -12380,7 +12380,7 @@
         <w:rPr>
           <w:rFonts w:eastAsia="標楷體"/>
         </w:rPr>
-        <w:t>此外，NamingRule、DependencyRule、SupertypeRule、PackageRule 為 ArchitectureConstraint 的泛化（generalization）子類型，以空心三角形箭頭表示繼承關係。</w:t>
+        <w:t>此外，NamingRule、DependencyRule、SupertypeRule、PackageRule 為 ComplianceRule 的泛化（generalization）子類型，以空心三角形箭頭表示繼承關係。</w:t>
       </w:r>
     </w:p>
     <w:p>
@@ -12655,7 +12655,7 @@
                 <w:b/>
                 <w:bCs/>
               </w:rPr>
-              <w:t>ArchitectureConstraint</w:t>
+              <w:t>ComplianceRule</w:t>
             </w:r>
           </w:p>
         </w:tc>
@@ -13650,7 +13650,7 @@
               <w:rPr>
                 <w:rFonts w:eastAsia="標楷體"/>
               </w:rPr>
-              <w:t>Use Case Controller：接收系統事件並協調 Domain 完成工作流程；並定義 port 介面（CodeParser、ProfileRepository、SuppressionRepository、Reporter）以隔離 Infrastructure 技術細節</w:t>
+              <w:t>Use Case Controller：接收系統事件並協調 Domain 完成工作流程；並定義 port 介面（CodeParser、ProfileLoader、SuppressionStore、Reporter）以隔離 Infrastructure 技術細節</w:t>
             </w:r>
           </w:p>
         </w:tc>
@@ -13716,7 +13716,7 @@
                 <w:b/>
                 <w:bCs/>
               </w:rPr>
-              <w:t>com.archchecker.domain.constraint</w:t>
+              <w:t>com.archchecker.domain.rule</w:t>
             </w:r>
           </w:p>
         </w:tc>
@@ -13746,7 +13746,7 @@
               <w:rPr>
                 <w:rFonts w:eastAsia="標楷體"/>
               </w:rPr>
-              <w:t>ArchitectureConstraint (abstract) 與四個具體規則：NamingRule、DependencyRule、SupertypeRule、PackageRule（多型 validate(files)）</w:t>
+              <w:t>ComplianceRule (abstract) 與四個具體規則：NamingRule、DependencyRule、SupertypeRule、PackageRule（多型 validate(files)）</w:t>
             </w:r>
           </w:p>
         </w:tc>
@@ -13842,7 +13842,7 @@
               <w:rPr>
                 <w:rFonts w:eastAsia="標楷體"/>
               </w:rPr>
-              <w:t>StyleProfile 設定檔模型，承載專案所選用的 ArchitectureConstraint 集合與相關參數</w:t>
+              <w:t>StyleProfile 設定檔模型，承載專案所選用的 ComplianceRule 集合與相關參數</w:t>
             </w:r>
           </w:p>
         </w:tc>
@@ -14558,7 +14558,7 @@
         <w:rPr>
           <w:rFonts w:eastAsia="標楷體"/>
         </w:rPr>
-        <w:t>主要相依方向為 Presentation → Application → Domain（虛線箭頭指向 target package）。Infrastructure 層不位於此單向鏈上，而是透過實作 Application 層所定義的 port 介面（CodeParser、ProfileRepository、SuppressionRepository、Reporter，定義位置見 3.1.1）反向相依於 Application，達成 Dependency Inversion；Domain 為核心抽象層，任何其他層皆可依賴它，但它不得相依於任何其他層。</w:t>
+        <w:t>主要相依方向為 Presentation → Application → Domain（虛線箭頭指向 target package）。Infrastructure 層不位於此單向鏈上，而是透過實作 Application 層所定義的 port 介面（CodeParser、ProfileLoader、SuppressionStore、Reporter，定義位置見 3.1.1）反向相依於 Application，達成 Dependency Inversion；Domain 為核心抽象層，任何其他層皆可依賴它，但它不得相依於任何其他層。</w:t>
       </w:r>
     </w:p>
     <w:tbl>
@@ -15036,7 +15036,7 @@
                 <w:b/>
                 <w:bCs/>
               </w:rPr>
-              <w:t>domain.constraint</w:t>
+              <w:t>domain.rule</w:t>
             </w:r>
           </w:p>
         </w:tc>
@@ -15066,7 +15066,7 @@
               <w:rPr>
                 <w:rFonts w:eastAsia="標楷體"/>
               </w:rPr>
-              <w:t>委派 ArchitectureConstraint.validate(files) 進行多型檢查</w:t>
+              <w:t>委派 ComplianceRule.validate(files) 進行多型檢查</w:t>
             </w:r>
           </w:p>
         </w:tc>
@@ -15162,7 +15162,7 @@
               <w:rPr>
                 <w:rFonts w:eastAsia="標楷體"/>
               </w:rPr>
-              <w:t>實作 application 層的 ProfileRepository port；載入 YAML Profile 並轉為 domain 物件</w:t>
+              <w:t>實作 application 層的 ProfileLoader port；載入 YAML Profile 並轉為 domain 物件</w:t>
             </w:r>
           </w:p>
         </w:tc>
@@ -15450,7 +15450,7 @@
               <w:rPr>
                 <w:rFonts w:eastAsia="標楷體"/>
               </w:rPr>
-              <w:t>實作 application 層的 SuppressionRepository port；讀寫 .arch-checker-suppress.yaml 並序列化 Suppression 物件</w:t>
+              <w:t>實作 application 層的 SuppressionStore port；讀寫 .arch-checker-suppress.yaml 並序列化 Suppression 物件</w:t>
             </w:r>
           </w:p>
         </w:tc>
@@ -15484,7 +15484,7 @@
                 <w:b/>
                 <w:bCs/>
               </w:rPr>
-              <w:t>domain.constraint</w:t>
+              <w:t>domain.rule</w:t>
             </w:r>
           </w:p>
         </w:tc>
@@ -15546,7 +15546,7 @@
               <w:rPr>
                 <w:rFonts w:eastAsia="標楷體"/>
               </w:rPr>
-              <w:t>ArchitectureConstraint.validate(files) 接收 File 集合，產生 Violation</w:t>
+              <w:t>ComplianceRule.validate(files) 接收 File 集合，產生 Violation</w:t>
             </w:r>
           </w:p>
         </w:tc>
@@ -15708,7 +15708,7 @@
                 <w:b/>
                 <w:bCs/>
               </w:rPr>
-              <w:t>domain.* (constraint / profile / codebase / compliance)</w:t>
+              <w:t>domain.* (rule / profile / codebase / compliance)</w:t>
             </w:r>
           </w:p>
         </w:tc>
@@ -17270,7 +17270,7 @@
               <w:rPr>
                 <w:rFonts w:eastAsia="標楷體"/>
               </w:rPr>
-              <w:t>constraint:ArchitectureConstraint + 4 Rule 子型別</w:t>
+              <w:t>rule:ComplianceRule + 4 Rule 子型別</w:t>
             </w:r>
           </w:p>
         </w:tc>
@@ -17362,7 +17362,7 @@
               <w:rPr>
                 <w:rFonts w:eastAsia="標楷體"/>
               </w:rPr>
-              <w:t>:SuppressionRepository</w:t>
+              <w:t>:SuppressionStore</w:t>
             </w:r>
           </w:p>
         </w:tc>
@@ -17454,7 +17454,7 @@
               <w:rPr>
                 <w:rFonts w:eastAsia="標楷體"/>
               </w:rPr>
-              <w:t>:JavaParserAdapter、:SuppressionRepository</w:t>
+              <w:t>:JavaParserAdapter、:SuppressionStore</w:t>
             </w:r>
           </w:p>
         </w:tc>
@@ -18920,7 +18920,7 @@
               <w:rPr>
                 <w:rFonts w:eastAsia="標楷體"/>
               </w:rPr>
-              <w:t>:SuppressionRepository</w:t>
+              <w:t>:SuppressionStore</w:t>
             </w:r>
           </w:p>
         </w:tc>
@@ -20069,7 +20069,7 @@
               <w:rPr>
                 <w:rFonts w:eastAsia="標楷體"/>
               </w:rPr>
-              <w:t>:SuppressionRepository</w:t>
+              <w:t>:SuppressionStore</w:t>
             </w:r>
           </w:p>
         </w:tc>
@@ -20727,7 +20727,7 @@
                 <w:rFonts w:ascii="Consolas" w:eastAsia="標楷體" w:hAnsi="Consolas"/>
                 <w:sz w:val="18"/>
               </w:rPr>
-              <w:t>- constraints: List&lt;ArchitectureConstraint&gt;</w:t>
+              <w:t>- rules: List&lt;ComplianceRule&gt;</w:t>
             </w:r>
           </w:p>
         </w:tc>
@@ -20760,7 +20760,7 @@
                 <w:rFonts w:ascii="Consolas" w:eastAsia="標楷體" w:hAnsi="Consolas"/>
                 <w:sz w:val="18"/>
               </w:rPr>
-              <w:t>+ getConstraints(): List&lt;ArchitectureConstraint&gt;</w:t>
+              <w:t>+ getRules(): List&lt;ComplianceRule&gt;</w:t>
             </w:r>
           </w:p>
           <w:p>
@@ -21081,7 +21081,7 @@
                 <w:sz w:val="20"/>
               </w:rPr>
               <w:lastRenderedPageBreak/>
-              <w:t>ArchitectureConstraint  «abstract»</w:t>
+              <w:t>ComplianceRule  «abstract»</w:t>
             </w:r>
           </w:p>
         </w:tc>
@@ -21918,7 +21918,7 @@
                 <w:rFonts w:ascii="Consolas" w:eastAsia="標楷體" w:hAnsi="Consolas"/>
                 <w:sz w:val="18"/>
               </w:rPr>
-              <w:t>- constraint: ArchitectureConstraint</w:t>
+              <w:t>- rule: ComplianceRule</w:t>
             </w:r>
           </w:p>
         </w:tc>
@@ -22084,7 +22084,7 @@
                 <w:rFonts w:ascii="Consolas" w:eastAsia="標楷體" w:hAnsi="Consolas"/>
                 <w:sz w:val="18"/>
               </w:rPr>
-              <w:t>- constraint: ArchitectureConstraint</w:t>
+              <w:t>- rule: ComplianceRule</w:t>
             </w:r>
           </w:p>
         </w:tc>
@@ -22664,7 +22664,7 @@
               <w:rPr>
                 <w:sz w:val="20"/>
               </w:rPr>
-              <w:t>getConstraints(): List&lt;ArchitectureConstraint&gt;</w:t>
+              <w:t>getRules(): List&lt;ComplianceRule&gt;</w:t>
             </w:r>
           </w:p>
         </w:tc>
@@ -23163,7 +23163,7 @@
               <w:rPr>
                 <w:sz w:val="20"/>
               </w:rPr>
-              <w:t>ArchitectureConstraint</w:t>
+              <w:t>ComplianceRule</w:t>
             </w:r>
           </w:p>
         </w:tc>
@@ -24502,7 +24502,7 @@
               <w:rPr>
                 <w:sz w:val="20"/>
               </w:rPr>
-              <w:t>getLineNumber / getMessage / getFile / getConstraint</w:t>
+              <w:t>getLineNumber / getMessage / getFile / getRule</w:t>
             </w:r>
           </w:p>
         </w:tc>
@@ -24651,7 +24651,7 @@
               <w:rPr>
                 <w:sz w:val="20"/>
               </w:rPr>
-              <w:t>5 getters (constraint, filePath, lineNumber, reason, timestamp)</w:t>
+              <w:t>5 getters (rule, filePath, lineNumber, reason, timestamp)</w:t>
             </w:r>
           </w:p>
         </w:tc>
@@ -25745,7 +25745,7 @@
               <w:rPr>
                 <w:sz w:val="20"/>
               </w:rPr>
-              <w:t>application.ProfileRepository «interface»</w:t>
+              <w:t>application.ProfileLoader «interface»</w:t>
             </w:r>
           </w:p>
         </w:tc>
@@ -25823,7 +25823,7 @@
               <w:rPr>
                 <w:sz w:val="20"/>
               </w:rPr>
-              <w:t>application.SuppressionRepository «interface»</w:t>
+              <w:t>application.SuppressionStore «interface»</w:t>
             </w:r>
           </w:p>
         </w:tc>
@@ -26213,7 +26213,7 @@
               <w:rPr>
                 <w:sz w:val="20"/>
               </w:rPr>
-              <w:t>domain.constraint.ArchitectureConstraint «abstract»</w:t>
+              <w:t>domain.rule.ComplianceRule «abstract»</w:t>
             </w:r>
           </w:p>
         </w:tc>
@@ -26291,7 +26291,7 @@
               <w:rPr>
                 <w:sz w:val="20"/>
               </w:rPr>
-              <w:t>domain.constraint.NamingRule</w:t>
+              <w:t>domain.rule.NamingRule</w:t>
             </w:r>
           </w:p>
         </w:tc>
@@ -26369,7 +26369,7 @@
               <w:rPr>
                 <w:sz w:val="20"/>
               </w:rPr>
-              <w:t>domain.constraint.DependencyRule</w:t>
+              <w:t>domain.rule.DependencyRule</w:t>
             </w:r>
           </w:p>
         </w:tc>
@@ -26447,7 +26447,7 @@
               <w:rPr>
                 <w:sz w:val="20"/>
               </w:rPr>
-              <w:t>domain.constraint.SupertypeRule</w:t>
+              <w:t>domain.rule.SupertypeRule</w:t>
             </w:r>
           </w:p>
         </w:tc>
@@ -26525,7 +26525,7 @@
               <w:rPr>
                 <w:sz w:val="20"/>
               </w:rPr>
-              <w:t>domain.constraint.PackageRule</w:t>
+              <w:t>domain.rule.PackageRule</w:t>
             </w:r>
           </w:p>
         </w:tc>
@@ -26993,7 +26993,7 @@
               <w:rPr>
                 <w:sz w:val="20"/>
               </w:rPr>
-              <w:t>infrastructure.profile.YamlProfileRepository</w:t>
+              <w:t>infrastructure.profile.YamlProfileLoader</w:t>
             </w:r>
           </w:p>
         </w:tc>
@@ -27227,7 +27227,7 @@
               <w:rPr>
                 <w:sz w:val="20"/>
               </w:rPr>
-              <w:t>infrastructure.suppression.YamlSuppressionRepository</w:t>
+              <w:t>infrastructure.suppression.YamlSuppressionStore</w:t>
             </w:r>
           </w:p>
         </w:tc>
@@ -27598,16 +27598,16 @@
         <w:pStyle w:val="3"/>
       </w:pPr>
       <w:r>
-        <w:t>5.2.1 domain.constraint.ArchitectureConstraint</w:t>
-      </w:r>
-    </w:p>
-    <w:p>
-      <w:r>
-        <w:rPr>
-          <w:rFonts w:ascii="Consolas" w:hAnsi="Consolas"/>
-          <w:sz w:val="18"/>
-        </w:rPr>
-        <w:t>package com.archchecker.domain.constraint;</w:t>
+        <w:t>5.2.1 domain.rule.ComplianceRule</w:t>
+      </w:r>
+    </w:p>
+    <w:p>
+      <w:r>
+        <w:rPr>
+          <w:rFonts w:ascii="Consolas" w:hAnsi="Consolas"/>
+          <w:sz w:val="18"/>
+        </w:rPr>
+        <w:t>package com.archchecker.domain.rule;</w:t>
       </w:r>
     </w:p>
     <w:p>
@@ -27670,7 +27670,7 @@
           <w:rFonts w:ascii="Consolas" w:hAnsi="Consolas"/>
           <w:sz w:val="18"/>
         </w:rPr>
-        <w:t>public abstract class ArchitectureConstraint {</w:t>
+        <w:t>public abstract class ComplianceRule {</w:t>
       </w:r>
     </w:p>
     <w:p>
@@ -27706,7 +27706,7 @@
           <w:rFonts w:ascii="Consolas" w:hAnsi="Consolas"/>
           <w:sz w:val="18"/>
         </w:rPr>
-        <w:t xml:space="preserve">    protected ArchitectureConstraint(String id, String description) {</w:t>
+        <w:t xml:space="preserve">    protected ComplianceRule(String id, String description) {</w:t>
       </w:r>
     </w:p>
     <w:p>
@@ -27931,16 +27931,16 @@
       </w:pPr>
       <w:r>
         <w:lastRenderedPageBreak/>
-        <w:t>5.2.2 domain.constraint.DependencyRule</w:t>
-      </w:r>
-    </w:p>
-    <w:p>
-      <w:r>
-        <w:rPr>
-          <w:rFonts w:ascii="Consolas" w:hAnsi="Consolas"/>
-          <w:sz w:val="18"/>
-        </w:rPr>
-        <w:t>package com.archchecker.domain.constraint;</w:t>
+        <w:t>5.2.2 domain.rule.DependencyRule</w:t>
+      </w:r>
+    </w:p>
+    <w:p>
+      <w:r>
+        <w:rPr>
+          <w:rFonts w:ascii="Consolas" w:hAnsi="Consolas"/>
+          <w:sz w:val="18"/>
+        </w:rPr>
+        <w:t>package com.archchecker.domain.rule;</w:t>
       </w:r>
     </w:p>
     <w:p>
@@ -28030,7 +28030,7 @@
           <w:rFonts w:ascii="Consolas" w:hAnsi="Consolas"/>
           <w:sz w:val="18"/>
         </w:rPr>
-        <w:t>public class DependencyRule extends ArchitectureConstraint {</w:t>
+        <w:t>public class DependencyRule extends ComplianceRule {</w:t>
       </w:r>
     </w:p>
     <w:p>
@@ -28434,16 +28434,16 @@
         <w:pStyle w:val="3"/>
       </w:pPr>
       <w:r>
-        <w:t>5.2.3 domain.constraint.NamingRule</w:t>
-      </w:r>
-    </w:p>
-    <w:p>
-      <w:r>
-        <w:rPr>
-          <w:rFonts w:ascii="Consolas" w:hAnsi="Consolas"/>
-          <w:sz w:val="18"/>
-        </w:rPr>
-        <w:t>package com.archchecker.domain.constraint;</w:t>
+        <w:t>5.2.3 domain.rule.NamingRule</w:t>
+      </w:r>
+    </w:p>
+    <w:p>
+      <w:r>
+        <w:rPr>
+          <w:rFonts w:ascii="Consolas" w:hAnsi="Consolas"/>
+          <w:sz w:val="18"/>
+        </w:rPr>
+        <w:t>package com.archchecker.domain.rule;</w:t>
       </w:r>
     </w:p>
     <w:p>
@@ -28534,7 +28534,7 @@
           <w:rFonts w:ascii="Consolas" w:hAnsi="Consolas"/>
           <w:sz w:val="18"/>
         </w:rPr>
-        <w:t>public class NamingRule extends ArchitectureConstraint {</w:t>
+        <w:t>public class NamingRule extends ComplianceRule {</w:t>
       </w:r>
     </w:p>
     <w:p>
@@ -28947,7 +28947,7 @@
           <w:rFonts w:ascii="Consolas" w:hAnsi="Consolas"/>
           <w:sz w:val="18"/>
         </w:rPr>
-        <w:t>import com.archchecker.domain.constraint.ArchitectureConstraint;</w:t>
+        <w:t>import com.archchecker.domain.rule.ComplianceRule;</w:t>
       </w:r>
     </w:p>
     <w:p>
@@ -29191,7 +29191,7 @@
           <w:rFonts w:ascii="Consolas" w:hAnsi="Consolas"/>
           <w:sz w:val="18"/>
         </w:rPr>
-        <w:t xml:space="preserve">        for (ArchitectureConstraint c : profile.getConstraints()) {</w:t>
+        <w:t xml:space="preserve">        for (ComplianceRule c : profile.getRules()) {</w:t>
       </w:r>
     </w:p>
     <w:p>
@@ -29541,16 +29541,16 @@
           <w:rFonts w:ascii="Consolas" w:hAnsi="Consolas"/>
           <w:sz w:val="18"/>
         </w:rPr>
-        <w:t xml:space="preserve">    private final ProfileRepository profileRepository;</w:t>
-      </w:r>
-    </w:p>
-    <w:p>
-      <w:r>
-        <w:rPr>
-          <w:rFonts w:ascii="Consolas" w:hAnsi="Consolas"/>
-          <w:sz w:val="18"/>
-        </w:rPr>
-        <w:t xml:space="preserve">    private final SuppressionRepository suppressionRepository;</w:t>
+        <w:t xml:space="preserve">    private final ProfileLoader profileLoader;</w:t>
+      </w:r>
+    </w:p>
+    <w:p>
+      <w:r>
+        <w:rPr>
+          <w:rFonts w:ascii="Consolas" w:hAnsi="Consolas"/>
+          <w:sz w:val="18"/>
+        </w:rPr>
+        <w:t xml:space="preserve">    private final SuppressionStore suppressionStore;</w:t>
       </w:r>
     </w:p>
     <w:p>
@@ -29577,16 +29577,16 @@
           <w:rFonts w:ascii="Consolas" w:hAnsi="Consolas"/>
           <w:sz w:val="18"/>
         </w:rPr>
-        <w:t xml:space="preserve">                                  ProfileRepository profileRepository,</w:t>
-      </w:r>
-    </w:p>
-    <w:p>
-      <w:r>
-        <w:rPr>
-          <w:rFonts w:ascii="Consolas" w:hAnsi="Consolas"/>
-          <w:sz w:val="18"/>
-        </w:rPr>
-        <w:t xml:space="preserve">                                  SuppressionRepository suppressionRepository) {</w:t>
+        <w:t xml:space="preserve">                                  ProfileLoader profileLoader,</w:t>
+      </w:r>
+    </w:p>
+    <w:p>
+      <w:r>
+        <w:rPr>
+          <w:rFonts w:ascii="Consolas" w:hAnsi="Consolas"/>
+          <w:sz w:val="18"/>
+        </w:rPr>
+        <w:t xml:space="preserve">                                  SuppressionStore suppressionStore) {</w:t>
       </w:r>
     </w:p>
     <w:p>
@@ -29604,7 +29604,7 @@
           <w:rFonts w:ascii="Consolas" w:hAnsi="Consolas"/>
           <w:sz w:val="18"/>
         </w:rPr>
-        <w:t xml:space="preserve">        this.profileRepository = profileRepository;</w:t>
+        <w:t xml:space="preserve">        this.profileLoader = profileLoader;</w:t>
       </w:r>
     </w:p>
     <w:p>
@@ -29614,7 +29614,7 @@
           <w:sz w:val="18"/>
         </w:rPr>
         <w:lastRenderedPageBreak/>
-        <w:t xml:space="preserve">        this.suppressionRepository = suppressionRepository;</w:t>
+        <w:t xml:space="preserve">        this.suppressionStore = suppressionStore;</w:t>
       </w:r>
     </w:p>
     <w:p>
@@ -29650,7 +29650,7 @@
           <w:rFonts w:ascii="Consolas" w:hAnsi="Consolas"/>
           <w:sz w:val="18"/>
         </w:rPr>
-        <w:t xml:space="preserve">        StyleProfile profile = profileRepository.load(profilePath);</w:t>
+        <w:t xml:space="preserve">        StyleProfile profile = profileLoader.load(profilePath);</w:t>
       </w:r>
     </w:p>
     <w:p>
@@ -29686,7 +29686,7 @@
           <w:rFonts w:ascii="Consolas" w:hAnsi="Consolas"/>
           <w:sz w:val="18"/>
         </w:rPr>
-        <w:t xml:space="preserve">                : suppressionRepository.loadAll(suppressionFile, profile);</w:t>
+        <w:t xml:space="preserve">                : suppressionStore.loadAll(suppressionFile, profile);</w:t>
       </w:r>
     </w:p>
     <w:p>
@@ -30089,7 +30089,7 @@
           <w:rFonts w:ascii="Consolas" w:hAnsi="Consolas"/>
           <w:sz w:val="18"/>
         </w:rPr>
-        <w:t>import com.archchecker.infrastructure.profile.YamlProfileRepository;</w:t>
+        <w:t>import com.archchecker.infrastructure.profile.YamlProfileLoader;</w:t>
       </w:r>
     </w:p>
     <w:p>
@@ -30116,7 +30116,7 @@
           <w:rFonts w:ascii="Consolas" w:hAnsi="Consolas"/>
           <w:sz w:val="18"/>
         </w:rPr>
-        <w:t>import com.archchecker.infrastructure.suppression.YamlSuppressionRepository;</w:t>
+        <w:t>import com.archchecker.infrastructure.suppression.YamlSuppressionStore;</w:t>
       </w:r>
     </w:p>
     <w:p>
@@ -30387,16 +30387,16 @@
           <w:rFonts w:ascii="Consolas" w:hAnsi="Consolas"/>
           <w:sz w:val="18"/>
         </w:rPr>
-        <w:t xml:space="preserve">                new YamlProfileRepository(),</w:t>
-      </w:r>
-    </w:p>
-    <w:p>
-      <w:r>
-        <w:rPr>
-          <w:rFonts w:ascii="Consolas" w:hAnsi="Consolas"/>
-          <w:sz w:val="18"/>
-        </w:rPr>
-        <w:t xml:space="preserve">                new YamlSuppressionRepository());</w:t>
+        <w:t xml:space="preserve">                new YamlProfileLoader(),</w:t>
+      </w:r>
+    </w:p>
+    <w:p>
+      <w:r>
+        <w:rPr>
+          <w:rFonts w:ascii="Consolas" w:hAnsi="Consolas"/>
+          <w:sz w:val="18"/>
+        </w:rPr>
+        <w:t xml:space="preserve">                new YamlSuppressionStore());</w:t>
       </w:r>
     </w:p>
     <w:p>
@@ -30917,7 +30917,7 @@
         <w:pStyle w:val="3"/>
       </w:pPr>
       <w:r>
-        <w:t>5.2.9 infrastructure.profile.YamlProfileRepository (SnakeYAML)</w:t>
+        <w:t>5.2.9 infrastructure.profile.YamlProfileLoader (SnakeYAML)</w:t>
       </w:r>
     </w:p>
     <w:p>
@@ -30944,52 +30944,52 @@
           <w:rFonts w:ascii="Consolas" w:hAnsi="Consolas"/>
           <w:sz w:val="18"/>
         </w:rPr>
-        <w:t>import com.archchecker.application.ProfileRepository;</w:t>
-      </w:r>
-    </w:p>
-    <w:p>
-      <w:r>
-        <w:rPr>
-          <w:rFonts w:ascii="Consolas" w:hAnsi="Consolas"/>
-          <w:sz w:val="18"/>
-        </w:rPr>
-        <w:t>import com.archchecker.domain.constraint.ArchitectureConstraint;</w:t>
-      </w:r>
-    </w:p>
-    <w:p>
-      <w:r>
-        <w:rPr>
-          <w:rFonts w:ascii="Consolas" w:hAnsi="Consolas"/>
-          <w:sz w:val="18"/>
-        </w:rPr>
-        <w:t>import com.archchecker.domain.constraint.DependencyRule;</w:t>
-      </w:r>
-    </w:p>
-    <w:p>
-      <w:r>
-        <w:rPr>
-          <w:rFonts w:ascii="Consolas" w:hAnsi="Consolas"/>
-          <w:sz w:val="18"/>
-        </w:rPr>
-        <w:t>import com.archchecker.domain.constraint.NamingRule;</w:t>
-      </w:r>
-    </w:p>
-    <w:p>
-      <w:r>
-        <w:rPr>
-          <w:rFonts w:ascii="Consolas" w:hAnsi="Consolas"/>
-          <w:sz w:val="18"/>
-        </w:rPr>
-        <w:t>import com.archchecker.domain.constraint.PackageRule;</w:t>
-      </w:r>
-    </w:p>
-    <w:p>
-      <w:r>
-        <w:rPr>
-          <w:rFonts w:ascii="Consolas" w:hAnsi="Consolas"/>
-          <w:sz w:val="18"/>
-        </w:rPr>
-        <w:t>import com.archchecker.domain.constraint.SupertypeRule;</w:t>
+        <w:t>import com.archchecker.application.ProfileLoader;</w:t>
+      </w:r>
+    </w:p>
+    <w:p>
+      <w:r>
+        <w:rPr>
+          <w:rFonts w:ascii="Consolas" w:hAnsi="Consolas"/>
+          <w:sz w:val="18"/>
+        </w:rPr>
+        <w:t>import com.archchecker.domain.rule.ComplianceRule;</w:t>
+      </w:r>
+    </w:p>
+    <w:p>
+      <w:r>
+        <w:rPr>
+          <w:rFonts w:ascii="Consolas" w:hAnsi="Consolas"/>
+          <w:sz w:val="18"/>
+        </w:rPr>
+        <w:t>import com.archchecker.domain.rule.DependencyRule;</w:t>
+      </w:r>
+    </w:p>
+    <w:p>
+      <w:r>
+        <w:rPr>
+          <w:rFonts w:ascii="Consolas" w:hAnsi="Consolas"/>
+          <w:sz w:val="18"/>
+        </w:rPr>
+        <w:t>import com.archchecker.domain.rule.NamingRule;</w:t>
+      </w:r>
+    </w:p>
+    <w:p>
+      <w:r>
+        <w:rPr>
+          <w:rFonts w:ascii="Consolas" w:hAnsi="Consolas"/>
+          <w:sz w:val="18"/>
+        </w:rPr>
+        <w:t>import com.archchecker.domain.rule.PackageRule;</w:t>
+      </w:r>
+    </w:p>
+    <w:p>
+      <w:r>
+        <w:rPr>
+          <w:rFonts w:ascii="Consolas" w:hAnsi="Consolas"/>
+          <w:sz w:val="18"/>
+        </w:rPr>
+        <w:t>import com.archchecker.domain.rule.SupertypeRule;</w:t>
       </w:r>
     </w:p>
     <w:p>
@@ -31106,7 +31106,7 @@
           <w:rFonts w:ascii="Consolas" w:hAnsi="Consolas"/>
           <w:sz w:val="18"/>
         </w:rPr>
-        <w:t>public class YamlProfileRepository implements ProfileRepository {</w:t>
+        <w:t>public class YamlProfileLoader implements ProfileLoader {</w:t>
       </w:r>
     </w:p>
     <w:p>
@@ -31277,7 +31277,7 @@
           <w:rFonts w:ascii="Consolas" w:hAnsi="Consolas"/>
           <w:sz w:val="18"/>
         </w:rPr>
-        <w:t xml:space="preserve">        List&lt;ArchitectureConstraint&gt; constraints = new ArrayList&lt;&gt;();</w:t>
+        <w:t xml:space="preserve">        List&lt;ComplianceRule&gt; rules = new ArrayList&lt;&gt;();</w:t>
       </w:r>
     </w:p>
     <w:p>
@@ -31314,7 +31314,7 @@
           <w:rFonts w:ascii="Consolas" w:hAnsi="Consolas"/>
           <w:sz w:val="18"/>
         </w:rPr>
-        <w:t xml:space="preserve">                constraints.add(toConstraint((Map&lt;String, Object&gt;) entry));</w:t>
+        <w:t xml:space="preserve">                rules.add(toRule((Map&lt;String, Object&gt;) entry));</w:t>
       </w:r>
     </w:p>
     <w:p>
@@ -31341,7 +31341,7 @@
           <w:rFonts w:ascii="Consolas" w:hAnsi="Consolas"/>
           <w:sz w:val="18"/>
         </w:rPr>
-        <w:t xml:space="preserve">        return new StyleProfile(name, constraints);</w:t>
+        <w:t xml:space="preserve">        return new StyleProfile(name, rules);</w:t>
       </w:r>
     </w:p>
     <w:p>
@@ -31368,7 +31368,7 @@
           <w:rFonts w:ascii="Consolas" w:hAnsi="Consolas"/>
           <w:sz w:val="18"/>
         </w:rPr>
-        <w:t xml:space="preserve">    private static ArchitectureConstraint toConstraint(Map&lt;String, Object&gt; m) {</w:t>
+        <w:t xml:space="preserve">    private static ComplianceRule toRule(Map&lt;String, Object&gt; m) {</w:t>
       </w:r>
     </w:p>
     <w:p>
@@ -31608,7 +31608,7 @@
     </w:p>
     <w:p>
       <w:r>
-        <w:t>Unit Test 採 JUnit 5 (Jupiter) 5.10.2 撰寫，遵循 Larman Ch 21 之 TDD/xUnit 三步驟（Create fixture → Execute method → Evaluate result）；測試檔位於 repository 根目錄之 src/test/java/。對所有架構規則（NamingRule、DependencyRule、SupertypeRule、PackageRule）、Application Service（ComplianceCheckService、SuppressionService）與兩個關鍵 Infrastructure Adapter（YamlProfileRepository、YamlSuppressionRepository）撰寫測試，共 21 個 test method 全數通過（mvn test 一次完成）。</w:t>
+        <w:t>Unit Test 採 JUnit 5 (Jupiter) 5.10.2 撰寫，遵循 Larman Ch 21 之 TDD/xUnit 三步驟（Create fixture → Execute method → Evaluate result）；測試檔位於 repository 根目錄之 src/test/java/。對所有架構規則（NamingRule、DependencyRule、SupertypeRule、PackageRule）、Application Service（ComplianceCheckService、SuppressionService）與兩個關鍵 Infrastructure Adapter（YamlProfileLoader、YamlSuppressionStore）撰寫測試，共 21 個 test method 全數通過（mvn test 一次完成）。</w:t>
       </w:r>
     </w:p>
     <w:p>
@@ -31709,7 +31709,7 @@
           <w:rFonts w:ascii="Consolas" w:hAnsi="Consolas"/>
           <w:sz w:val="18"/>
         </w:rPr>
-        <w:t>[INFO] Running com.archchecker.domain.constraint.DependencyRuleTest</w:t>
+        <w:t>[INFO] Running com.archchecker.domain.rule.DependencyRuleTest</w:t>
       </w:r>
     </w:p>
     <w:p>
@@ -31727,7 +31727,7 @@
           <w:rFonts w:ascii="Consolas" w:hAnsi="Consolas"/>
           <w:sz w:val="18"/>
         </w:rPr>
-        <w:t>[INFO] Running com.archchecker.domain.constraint.NamingRuleTest</w:t>
+        <w:t>[INFO] Running com.archchecker.domain.rule.NamingRuleTest</w:t>
       </w:r>
     </w:p>
     <w:p>
@@ -31746,7 +31746,7 @@
           <w:sz w:val="18"/>
         </w:rPr>
         <w:lastRenderedPageBreak/>
-        <w:t>[INFO] Running com.archchecker.domain.constraint.PackageRuleTest</w:t>
+        <w:t>[INFO] Running com.archchecker.domain.rule.PackageRuleTest</w:t>
       </w:r>
     </w:p>
     <w:p>
@@ -31764,7 +31764,7 @@
           <w:rFonts w:ascii="Consolas" w:hAnsi="Consolas"/>
           <w:sz w:val="18"/>
         </w:rPr>
-        <w:t>[INFO] Running com.archchecker.domain.constraint.SupertypeRuleTest</w:t>
+        <w:t>[INFO] Running com.archchecker.domain.rule.SupertypeRuleTest</w:t>
       </w:r>
     </w:p>
     <w:p>
@@ -31782,7 +31782,7 @@
           <w:rFonts w:ascii="Consolas" w:hAnsi="Consolas"/>
           <w:sz w:val="18"/>
         </w:rPr>
-        <w:t>[INFO] Running com.archchecker.infrastructure.profile.YamlProfileRepositoryTest</w:t>
+        <w:t>[INFO] Running com.archchecker.infrastructure.profile.YamlProfileLoaderTest</w:t>
       </w:r>
     </w:p>
     <w:p>
@@ -31800,7 +31800,7 @@
           <w:rFonts w:ascii="Consolas" w:hAnsi="Consolas"/>
           <w:sz w:val="18"/>
         </w:rPr>
-        <w:t>[INFO] Running com.archchecker.infrastructure.suppression.YamlSuppressionRepositoryTest</w:t>
+        <w:t>[INFO] Running com.archchecker.infrastructure.suppression.YamlSuppressionStoreTest</w:t>
       </w:r>
     </w:p>
     <w:p>
@@ -32295,7 +32295,7 @@
               <w:rPr>
                 <w:sz w:val="20"/>
               </w:rPr>
-              <w:t>YamlProfileRepositoryTest</w:t>
+              <w:t>YamlProfileLoaderTest</w:t>
             </w:r>
           </w:p>
         </w:tc>
@@ -32354,7 +32354,7 @@
               <w:rPr>
                 <w:sz w:val="20"/>
               </w:rPr>
-              <w:t>YamlSuppressionRepositoryTest</w:t>
+              <w:t>YamlSuppressionStoreTest</w:t>
             </w:r>
           </w:p>
         </w:tc>
@@ -32410,7 +32410,7 @@
     </w:p>
     <w:p>
       <w:r>
-        <w:t>下方節錄 4 份最具代表性的測試類別（涵蓋 Domain Constraint、Application Service、Infrastructure Repository 三層）。完整 8 份測試碼存於 src/test/java/，本節合計約 230 LOC（不超過 10 頁）。</w:t>
+        <w:t>下方節錄 4 份最具代表性的測試類別（涵蓋 Domain Constraint、Application Service、Infrastructure Adapter 三層）。完整 8 份測試碼存於 src/test/java/，本節合計約 230 LOC（不超過 10 頁）。</w:t>
       </w:r>
     </w:p>
     <w:p>
@@ -32418,16 +32418,16 @@
         <w:pStyle w:val="3"/>
       </w:pPr>
       <w:r>
-        <w:t>6.2.1 domain.constraint.NamingRuleTest</w:t>
-      </w:r>
-    </w:p>
-    <w:p>
-      <w:r>
-        <w:rPr>
-          <w:rFonts w:ascii="Consolas" w:hAnsi="Consolas"/>
-          <w:sz w:val="18"/>
-        </w:rPr>
-        <w:t>package com.archchecker.domain.constraint;</w:t>
+        <w:t>6.2.1 domain.rule.NamingRuleTest</w:t>
+      </w:r>
+    </w:p>
+    <w:p>
+      <w:r>
+        <w:rPr>
+          <w:rFonts w:ascii="Consolas" w:hAnsi="Consolas"/>
+          <w:sz w:val="18"/>
+        </w:rPr>
+        <w:t>package com.archchecker.domain.rule;</w:t>
       </w:r>
     </w:p>
     <w:p>
@@ -32958,16 +32958,16 @@
         <w:pStyle w:val="3"/>
       </w:pPr>
       <w:r>
-        <w:t>6.2.2 domain.constraint.DependencyRuleTest</w:t>
-      </w:r>
-    </w:p>
-    <w:p>
-      <w:r>
-        <w:rPr>
-          <w:rFonts w:ascii="Consolas" w:hAnsi="Consolas"/>
-          <w:sz w:val="18"/>
-        </w:rPr>
-        <w:t>package com.archchecker.domain.constraint;</w:t>
+        <w:t>6.2.2 domain.rule.DependencyRuleTest</w:t>
+      </w:r>
+    </w:p>
+    <w:p>
+      <w:r>
+        <w:rPr>
+          <w:rFonts w:ascii="Consolas" w:hAnsi="Consolas"/>
+          <w:sz w:val="18"/>
+        </w:rPr>
+        <w:t>package com.archchecker.domain.rule;</w:t>
       </w:r>
     </w:p>
     <w:p>
@@ -33597,7 +33597,7 @@
           <w:rFonts w:ascii="Consolas" w:hAnsi="Consolas"/>
           <w:sz w:val="18"/>
         </w:rPr>
-        <w:t>import com.archchecker.domain.constraint.ArchitectureConstraint;</w:t>
+        <w:t>import com.archchecker.domain.rule.ComplianceRule;</w:t>
       </w:r>
     </w:p>
     <w:p>
@@ -34264,7 +34264,7 @@
           <w:rFonts w:ascii="Consolas" w:hAnsi="Consolas"/>
           <w:sz w:val="18"/>
         </w:rPr>
-        <w:t xml:space="preserve">    private static class FakeProfileRepo implements ProfileRepository {</w:t>
+        <w:t xml:space="preserve">    private static class FakeProfileRepo implements ProfileLoader {</w:t>
       </w:r>
     </w:p>
     <w:p>
@@ -34319,7 +34319,7 @@
           <w:rFonts w:ascii="Consolas" w:hAnsi="Consolas"/>
           <w:sz w:val="18"/>
         </w:rPr>
-        <w:t xml:space="preserve">    private static class FakeSupRepo implements SuppressionRepository {</w:t>
+        <w:t xml:space="preserve">    private static class FakeSupRepo implements SuppressionStore {</w:t>
       </w:r>
     </w:p>
     <w:p>
@@ -34382,7 +34382,7 @@
           <w:rFonts w:ascii="Consolas" w:hAnsi="Consolas"/>
           <w:sz w:val="18"/>
         </w:rPr>
-        <w:t xml:space="preserve">    private static class AlwaysPassRule extends ArchitectureConstraint {</w:t>
+        <w:t xml:space="preserve">    private static class AlwaysPassRule extends ComplianceRule {</w:t>
       </w:r>
     </w:p>
     <w:p>
@@ -34445,7 +34445,7 @@
           <w:rFonts w:ascii="Consolas" w:hAnsi="Consolas"/>
           <w:sz w:val="18"/>
         </w:rPr>
-        <w:t xml:space="preserve">    private static class AlwaysFailRule extends ArchitectureConstraint {</w:t>
+        <w:t xml:space="preserve">    private static class AlwaysFailRule extends ComplianceRule {</w:t>
       </w:r>
     </w:p>
     <w:p>
@@ -34525,7 +34525,7 @@
         <w:pStyle w:val="3"/>
       </w:pPr>
       <w:r>
-        <w:t>6.2.4 infrastructure.suppression.YamlSuppressionRepositoryTest</w:t>
+        <w:t>6.2.4 infrastructure.suppression.YamlSuppressionStoreTest</w:t>
       </w:r>
     </w:p>
     <w:p>
@@ -34561,7 +34561,7 @@
           <w:rFonts w:ascii="Consolas" w:hAnsi="Consolas"/>
           <w:sz w:val="18"/>
         </w:rPr>
-        <w:t>import com.archchecker.domain.constraint.NamingRule;</w:t>
+        <w:t>import com.archchecker.domain.rule.NamingRule;</w:t>
       </w:r>
     </w:p>
     <w:p>
@@ -34687,7 +34687,7 @@
           <w:rFonts w:ascii="Consolas" w:hAnsi="Consolas"/>
           <w:sz w:val="18"/>
         </w:rPr>
-        <w:t>class YamlSuppressionRepositoryTest {</w:t>
+        <w:t>class YamlSuppressionStoreTest {</w:t>
       </w:r>
     </w:p>
     <w:p>
@@ -34741,7 +34741,7 @@
           <w:rFonts w:ascii="Consolas" w:hAnsi="Consolas"/>
           <w:sz w:val="18"/>
         </w:rPr>
-        <w:t xml:space="preserve">        Suppression sup = new Suppression(profile.getConstraints().get(0),</w:t>
+        <w:t xml:space="preserve">        Suppression sup = new Suppression(profile.getRules().get(0),</w:t>
       </w:r>
     </w:p>
     <w:p>
@@ -34777,7 +34777,7 @@
           <w:rFonts w:ascii="Consolas" w:hAnsi="Consolas"/>
           <w:sz w:val="18"/>
         </w:rPr>
-        <w:t xml:space="preserve">        YamlSuppressionRepository repo = new YamlSuppressionRepository();</w:t>
+        <w:t xml:space="preserve">        YamlSuppressionStore repo = new YamlSuppressionStore();</w:t>
       </w:r>
     </w:p>
     <w:p>
@@ -34840,7 +34840,7 @@
           <w:rFonts w:ascii="Consolas" w:hAnsi="Consolas"/>
           <w:sz w:val="18"/>
         </w:rPr>
-        <w:t xml:space="preserve">        assertEquals("R-NAME-01", r.getConstraint().getId());</w:t>
+        <w:t xml:space="preserve">        assertEquals("R-NAME-01", r.getRule().getId());</w:t>
       </w:r>
     </w:p>
     <w:p>
@@ -34931,7 +34931,7 @@
           <w:rFonts w:ascii="Consolas" w:hAnsi="Consolas"/>
           <w:sz w:val="18"/>
         </w:rPr>
-        <w:t xml:space="preserve">        YamlSuppressionRepository repo = new YamlSuppressionRepository();</w:t>
+        <w:t xml:space="preserve">        YamlSuppressionStore repo = new YamlSuppressionStore();</w:t>
       </w:r>
     </w:p>
     <w:p>
@@ -35093,7 +35093,7 @@
           <w:rFonts w:ascii="Consolas" w:hAnsi="Consolas"/>
           <w:sz w:val="18"/>
         </w:rPr>
-        <w:t xml:space="preserve">        YamlSuppressionRepository repo = new YamlSuppressionRepository();</w:t>
+        <w:t xml:space="preserve">        YamlSuppressionStore repo = new YamlSuppressionStore();</w:t>
       </w:r>
     </w:p>
     <w:p>

</xml_diff>